<commit_message>
Set author name, stop tracking node_modules, re-verify 14 unit and 38 e2e tests
Co-Authored-By: Claude Sonnet 5.5 <noreply@anthropic.com>
Claude-Session: https://claude.ai/code/session_016KZaRNAsEycNYHuGW6T7gR
</commit_message>
<xml_diff>
--- a/docs/BRD.docx
+++ b/docs/BRD.docx
@@ -196,7 +196,7 @@
                 <w:rFonts w:ascii="Arial" w:hAnsi="Arial"/>
                 <w:sz w:val="18"/>
               </w:rPr>
-              <w:t xml:space="preserve">Archana Jangamgunta (Business Analyst)</w:t>
+              <w:t>Eswara Krishna Bodi (Business Analyst)</w:t>
             </w:r>
           </w:p>
         </w:tc>
@@ -10224,6 +10224,8 @@
     <w:bookmarkEnd w:id="48"/>
     <w:bookmarkEnd w:id="49"/>
     <w:sectPr>
+      <w:headerReference w:type="default" r:id="rId9"/>
+      <w:footerReference w:type="default" r:id="rId10"/>
       <w:pgMar w:left="1296" w:right="1296"/>
     </w:sectPr>
   </w:body>
@@ -10234,6 +10236,16 @@
 <w:comments xmlns:w="http://schemas.openxmlformats.org/wordprocessingml/2006/main" xmlns:m="http://schemas.openxmlformats.org/officeDocument/2006/math" xmlns:r="http://schemas.openxmlformats.org/officeDocument/2006/relationships" xmlns:o="urn:schemas-microsoft-com:office:office" xmlns:v="urn:schemas-microsoft-com:vml" xmlns:w10="urn:schemas-microsoft-com:office:word" xmlns:a="http://schemas.openxmlformats.org/drawingml/2006/main" xmlns:pic="http://schemas.openxmlformats.org/drawingml/2006/picture" xmlns:wp="http://schemas.openxmlformats.org/drawingml/2006/wordprocessingDrawing"/>
 </file>
 
+<file path=word/footer1.xml><?xml version="1.0" encoding="utf-8"?>
+<w:ftr xmlns:m="http://schemas.openxmlformats.org/officeDocument/2006/math" xmlns:mc="http://schemas.openxmlformats.org/markup-compatibility/2006" xmlns:mo="http://schemas.microsoft.com/office/mac/office/2008/main" xmlns:mv="urn:schemas-microsoft-com:mac:vml" xmlns:o="urn:schemas-microsoft-com:office:office" xmlns:r="http://schemas.openxmlformats.org/officeDocument/2006/relationships" xmlns:v="urn:schemas-microsoft-com:vml" xmlns:w10="urn:schemas-microsoft-com:office:word" xmlns:w14="http://schemas.microsoft.com/office/word/2010/wordml" xmlns:w="http://schemas.openxmlformats.org/wordprocessingml/2006/main" xmlns:wne="http://schemas.microsoft.com/office/word/2006/wordml" xmlns:wp14="http://schemas.microsoft.com/office/word/2010/wordprocessingDrawing" xmlns:wp="http://schemas.openxmlformats.org/drawingml/2006/wordprocessingDrawing" xmlns:wpc="http://schemas.microsoft.com/office/word/2010/wordprocessingCanvas" xmlns:wpg="http://schemas.microsoft.com/office/word/2010/wordprocessingGroup" xmlns:wpi="http://schemas.microsoft.com/office/word/2010/wordprocessingInk" xmlns:wps="http://schemas.microsoft.com/office/word/2010/wordprocessingShape" mc:Ignorable="w14 wp14">
+  <w:p>
+    <w:pPr>
+      <w:pStyle w:val="Footer"/>
+    </w:pPr>
+  </w:p>
+</w:ftr>
+</file>
+
 <file path=word/footnotes.xml><?xml version="1.0" encoding="utf-8"?>
 <w:footnotes xmlns:w="http://schemas.openxmlformats.org/wordprocessingml/2006/main" xmlns:m="http://schemas.openxmlformats.org/officeDocument/2006/math" xmlns:r="http://schemas.openxmlformats.org/officeDocument/2006/relationships" xmlns:o="urn:schemas-microsoft-com:office:office" xmlns:v="urn:schemas-microsoft-com:vml" xmlns:w10="urn:schemas-microsoft-com:office:word" xmlns:a="http://schemas.openxmlformats.org/drawingml/2006/main" xmlns:pic="http://schemas.openxmlformats.org/drawingml/2006/picture" xmlns:wp="http://schemas.openxmlformats.org/drawingml/2006/wordprocessingDrawing">
   <w:footnote w:type="continuationSeparator" w:id="0">
@@ -10251,6 +10263,16 @@
     </w:p>
   </w:footnote>
 </w:footnotes>
+</file>
+
+<file path=word/header1.xml><?xml version="1.0" encoding="utf-8"?>
+<w:hdr xmlns:m="http://schemas.openxmlformats.org/officeDocument/2006/math" xmlns:mc="http://schemas.openxmlformats.org/markup-compatibility/2006" xmlns:mo="http://schemas.microsoft.com/office/mac/office/2008/main" xmlns:mv="urn:schemas-microsoft-com:mac:vml" xmlns:o="urn:schemas-microsoft-com:office:office" xmlns:r="http://schemas.openxmlformats.org/officeDocument/2006/relationships" xmlns:v="urn:schemas-microsoft-com:vml" xmlns:w10="urn:schemas-microsoft-com:office:word" xmlns:w14="http://schemas.microsoft.com/office/word/2010/wordml" xmlns:w="http://schemas.openxmlformats.org/wordprocessingml/2006/main" xmlns:wne="http://schemas.microsoft.com/office/word/2006/wordml" xmlns:wp14="http://schemas.microsoft.com/office/word/2010/wordprocessingDrawing" xmlns:wp="http://schemas.openxmlformats.org/drawingml/2006/wordprocessingDrawing" xmlns:wpc="http://schemas.microsoft.com/office/word/2010/wordprocessingCanvas" xmlns:wpg="http://schemas.microsoft.com/office/word/2010/wordprocessingGroup" xmlns:wpi="http://schemas.microsoft.com/office/word/2010/wordprocessingInk" xmlns:wps="http://schemas.microsoft.com/office/word/2010/wordprocessingShape" mc:Ignorable="w14 wp14">
+  <w:p>
+    <w:pPr>
+      <w:pStyle w:val="Header"/>
+    </w:pPr>
+  </w:p>
+</w:hdr>
 </file>
 
 <file path=word/numbering.xml><?xml version="1.0" encoding="utf-8"?>

</xml_diff>